<commit_message>
docs: update lab04 report with official Pull Request #3 link
</commit_message>
<xml_diff>
--- a/Lab04_Akishev_IS-2406.docx
+++ b/Lab04_Akishev_IS-2406.docx
@@ -167,6 +167,22 @@
           <w:b/>
           <w:sz w:val="23"/>
         </w:rPr>
+        <w:t xml:space="preserve">Pull Request: </w:t>
+      </w:r>
+      <w:r>
+        <w:rPr>
+          <w:rFonts w:ascii="Calibri" w:hAnsi="Calibri"/>
+          <w:sz w:val="23"/>
+        </w:rPr>
+        <w:t>https://github.com/adilkhanakishev/spring-lab-01/pull/3</w:t>
+        <w:br/>
+      </w:r>
+      <w:r>
+        <w:rPr>
+          <w:rFonts w:ascii="Calibri" w:hAnsi="Calibri"/>
+          <w:b/>
+          <w:sz w:val="23"/>
+        </w:rPr>
         <w:t xml:space="preserve">Date: </w:t>
       </w:r>
       <w:r>
@@ -258,6 +274,40 @@
           <w:sz w:val="22"/>
         </w:rPr>
         <w:t>https://github.com/adilkhanakishev/spring-lab-01 (branch: lab04)</w:t>
+      </w:r>
+    </w:p>
+    <w:p>
+      <w:pPr>
+        <w:spacing w:before="40" w:after="80" w:line="276" w:lineRule="auto"/>
+      </w:pPr>
+      <w:r>
+        <w:rPr>
+          <w:rFonts w:ascii="Calibri" w:hAnsi="Calibri"/>
+          <w:b/>
+          <w:sz w:val="22"/>
+        </w:rPr>
+        <w:t xml:space="preserve">Pull Request Link: </w:t>
+      </w:r>
+      <w:r>
+        <w:rPr>
+          <w:rFonts w:ascii="Calibri" w:hAnsi="Calibri"/>
+          <w:color w:val="1E1E1E"/>
+          <w:sz w:val="22"/>
+        </w:rPr>
+        <w:t>GitHub Pull Request:</w:t>
+      </w:r>
+    </w:p>
+    <w:p>
+      <w:pPr>
+        <w:spacing w:before="40" w:after="80" w:line="276" w:lineRule="auto"/>
+      </w:pPr>
+      <w:r>
+        <w:rPr>
+          <w:rFonts w:ascii="Calibri" w:hAnsi="Calibri"/>
+          <w:color w:val="1E1E1E"/>
+          <w:sz w:val="22"/>
+        </w:rPr>
+        <w:t>https://github.com/adilkhanakishev/spring-lab-01/pull/3</w:t>
       </w:r>
     </w:p>
     <w:p>

</xml_diff>

<commit_message>
docs: add screenshots to lab04 report
</commit_message>
<xml_diff>
--- a/Lab04_Akishev_IS-2406.docx
+++ b/Lab04_Akishev_IS-2406.docx
@@ -312,6 +312,62 @@
     </w:p>
     <w:p>
       <w:pPr>
+        <w:keepNext/>
+        <w:spacing w:before="160" w:after="40"/>
+        <w:jc w:val="center"/>
+      </w:pPr>
+      <w:r>
+        <w:drawing>
+          <wp:inline xmlns:a="http://schemas.openxmlformats.org/drawingml/2006/main" xmlns:pic="http://schemas.openxmlformats.org/drawingml/2006/picture">
+            <wp:extent cx="5577840" cy="2952333"/>
+            <wp:docPr id="1" name="Picture 1"/>
+            <wp:cNvGraphicFramePr>
+              <a:graphicFrameLocks noChangeAspect="1"/>
+            </wp:cNvGraphicFramePr>
+            <a:graphic>
+              <a:graphicData uri="http://schemas.openxmlformats.org/drawingml/2006/picture">
+                <pic:pic>
+                  <pic:nvPicPr>
+                    <pic:cNvPr id="0" name="media_1790648919795.png"/>
+                    <pic:cNvPicPr/>
+                  </pic:nvPicPr>
+                  <pic:blipFill>
+                    <a:blip r:embed="rId9"/>
+                    <a:stretch>
+                      <a:fillRect/>
+                    </a:stretch>
+                  </pic:blipFill>
+                  <pic:spPr>
+                    <a:xfrm>
+                      <a:off x="0" y="0"/>
+                      <a:ext cx="5577840" cy="2952333"/>
+                    </a:xfrm>
+                    <a:prstGeom prst="rect"/>
+                  </pic:spPr>
+                </pic:pic>
+              </a:graphicData>
+            </a:graphic>
+          </wp:inline>
+        </w:drawing>
+      </w:r>
+    </w:p>
+    <w:p>
+      <w:pPr>
+        <w:spacing w:before="40" w:after="160"/>
+        <w:jc w:val="center"/>
+      </w:pPr>
+      <w:r>
+        <w:rPr>
+          <w:rFonts w:ascii="Calibri" w:hAnsi="Calibri"/>
+          <w:i/>
+          <w:color w:val="505050"/>
+          <w:sz w:val="19"/>
+        </w:rPr>
+        <w:t>Figure 1: Official GitHub Pull Request #3 (lab04 -&gt; main)</w:t>
+      </w:r>
+    </w:p>
+    <w:p>
+      <w:pPr>
         <w:pStyle w:val="Heading1"/>
         <w:keepNext/>
         <w:spacing w:before="240" w:after="80"/>
@@ -1121,6 +1177,62 @@
         <w:t>When the endpoint GET /api/lab4/items?limit=5 is invoked, all three aspects (@Order(1), @Order(2), @Order(3)) intercept the execution of CatalogService.findAll(int). The resulting log demonstrates strict adherence to the @Order precedence hierarchy:</w:t>
       </w:r>
     </w:p>
+    <w:p>
+      <w:pPr>
+        <w:keepNext/>
+        <w:spacing w:before="160" w:after="40"/>
+        <w:jc w:val="center"/>
+      </w:pPr>
+      <w:r>
+        <w:drawing>
+          <wp:inline xmlns:a="http://schemas.openxmlformats.org/drawingml/2006/main" xmlns:pic="http://schemas.openxmlformats.org/drawingml/2006/picture">
+            <wp:extent cx="5577840" cy="2974122"/>
+            <wp:docPr id="2" name="Picture 2"/>
+            <wp:cNvGraphicFramePr>
+              <a:graphicFrameLocks noChangeAspect="1"/>
+            </wp:cNvGraphicFramePr>
+            <a:graphic>
+              <a:graphicData uri="http://schemas.openxmlformats.org/drawingml/2006/picture">
+                <pic:pic>
+                  <pic:nvPicPr>
+                    <pic:cNvPr id="0" name="media_1790648548993.png"/>
+                    <pic:cNvPicPr/>
+                  </pic:nvPicPr>
+                  <pic:blipFill>
+                    <a:blip r:embed="rId10"/>
+                    <a:stretch>
+                      <a:fillRect/>
+                    </a:stretch>
+                  </pic:blipFill>
+                  <pic:spPr>
+                    <a:xfrm>
+                      <a:off x="0" y="0"/>
+                      <a:ext cx="5577840" cy="2974122"/>
+                    </a:xfrm>
+                    <a:prstGeom prst="rect"/>
+                  </pic:spPr>
+                </pic:pic>
+              </a:graphicData>
+            </a:graphic>
+          </wp:inline>
+        </w:drawing>
+      </w:r>
+    </w:p>
+    <w:p>
+      <w:pPr>
+        <w:spacing w:before="40" w:after="160"/>
+        <w:jc w:val="center"/>
+      </w:pPr>
+      <w:r>
+        <w:rPr>
+          <w:rFonts w:ascii="Calibri" w:hAnsi="Calibri"/>
+          <w:i/>
+          <w:color w:val="505050"/>
+          <w:sz w:val="19"/>
+        </w:rPr>
+        <w:t>Figure 2: Execution log in IntelliJ IDEA Run console for GET /api/lab4/items?limit=5</w:t>
+      </w:r>
+    </w:p>
     <w:tbl>
       <w:tblPr>
         <w:tblW w:type="auto" w:w="0"/>
@@ -1152,13 +1264,13 @@
                 <w:color w:val="1E293B"/>
                 <w:sz w:val="19"/>
               </w:rPr>
-              <w:t>[1] INFO  kz.iitu.springlab.aspect.AuditAspect     : [AUDIT] start CATALOG_LIST at 2026-09-29 06:48:31 method=CatalogService.findAll(..) args=[5]</w:t>
+              <w:t>[1] INFO  kz.iitu.springlab.aspect.AuditAspect     : [AUDIT] start CATALOG_LIST at 2026-09-29 07:21:42 method=CatalogService.findAll(..) args=[5]</w:t>
               <w:br/>
               <w:t>[2] INFO  kz.iitu.springlab.aspect.LoggingAspect   : [LOG] -&gt; CatalogService.findAll(..) args=[5]</w:t>
               <w:br/>
               <w:t>[3] INFO  k.i.springlab.aspect.SlowMethodAspect    : [SLOW-LOG] Collected slow method call: CatalogService.findAll(..) (took 303 ms &gt;= threshold 200 ms)</w:t>
               <w:br/>
-              <w:t>[4] WARN  kz.iitu.springlab.aspect.TimingAspect    : [TIME] SLOW: CatalogService.findAll(..) - 306 ms</w:t>
+              <w:t>[4] WARN  kz.iitu.springlab.aspect.TimingAspect    : [TIME] SLOW: CatalogService.findAll(..) - 307 ms</w:t>
               <w:br/>
               <w:t>[5] INFO  kz.iitu.springlab.aspect.LoggingAspect   : [LOG] &lt;- CatalogService.findAll(..) returned [Item no. 1, Item no. 2, Item no. 3, Item no. 4, Item no. 5]</w:t>
               <w:br/>
@@ -1445,7 +1557,7 @@
                 <w:rFonts w:ascii="Calibri" w:hAnsi="Calibri"/>
                 <w:sz w:val="19"/>
               </w:rPr>
-              <w:t>[TIME] SLOW: CatalogService.findAll(..) - 306 ms</w:t>
+              <w:t>[TIME] SLOW: CatalogService.findAll(..) - 307 ms</w:t>
             </w:r>
           </w:p>
         </w:tc>
@@ -1644,6 +1756,62 @@
         <w:t>When DELETE /api/lab4/item/0 is called, CatalogService.remove(0) throws IllegalArgumentException("Invalid identifier: 0"). The exception is intercepted by the aspect chain without being suppressed:</w:t>
       </w:r>
     </w:p>
+    <w:p>
+      <w:pPr>
+        <w:keepNext/>
+        <w:spacing w:before="160" w:after="40"/>
+        <w:jc w:val="center"/>
+      </w:pPr>
+      <w:r>
+        <w:drawing>
+          <wp:inline xmlns:a="http://schemas.openxmlformats.org/drawingml/2006/main" xmlns:pic="http://schemas.openxmlformats.org/drawingml/2006/picture">
+            <wp:extent cx="5577840" cy="2990463"/>
+            <wp:docPr id="3" name="Picture 3"/>
+            <wp:cNvGraphicFramePr>
+              <a:graphicFrameLocks noChangeAspect="1"/>
+            </wp:cNvGraphicFramePr>
+            <a:graphic>
+              <a:graphicData uri="http://schemas.openxmlformats.org/drawingml/2006/picture">
+                <pic:pic>
+                  <pic:nvPicPr>
+                    <pic:cNvPr id="0" name="media_1790648690303.png"/>
+                    <pic:cNvPicPr/>
+                  </pic:nvPicPr>
+                  <pic:blipFill>
+                    <a:blip r:embed="rId11"/>
+                    <a:stretch>
+                      <a:fillRect/>
+                    </a:stretch>
+                  </pic:blipFill>
+                  <pic:spPr>
+                    <a:xfrm>
+                      <a:off x="0" y="0"/>
+                      <a:ext cx="5577840" cy="2990463"/>
+                    </a:xfrm>
+                    <a:prstGeom prst="rect"/>
+                  </pic:spPr>
+                </pic:pic>
+              </a:graphicData>
+            </a:graphic>
+          </wp:inline>
+        </w:drawing>
+      </w:r>
+    </w:p>
+    <w:p>
+      <w:pPr>
+        <w:spacing w:before="40" w:after="160"/>
+        <w:jc w:val="center"/>
+      </w:pPr>
+      <w:r>
+        <w:rPr>
+          <w:rFonts w:ascii="Calibri" w:hAnsi="Calibri"/>
+          <w:i/>
+          <w:color w:val="505050"/>
+          <w:sz w:val="19"/>
+        </w:rPr>
+        <w:t>Figure 3: Exception handling log in IntelliJ IDEA Run console for DELETE /api/lab4/item/0</w:t>
+      </w:r>
+    </w:p>
     <w:tbl>
       <w:tblPr>
         <w:tblW w:type="auto" w:w="0"/>
@@ -1675,7 +1843,7 @@
                 <w:color w:val="1E293B"/>
                 <w:sz w:val="19"/>
               </w:rPr>
-              <w:t>[1] INFO  kz.iitu.springlab.aspect.AuditAspect     : [AUDIT] start CATALOG_REMOVE at 2026-09-29 06:48:31 method=CatalogService.remove(..)</w:t>
+              <w:t>[1] INFO  kz.iitu.springlab.aspect.AuditAspect     : [AUDIT] start CATALOG_REMOVE at 2026-09-29 07:24:13 method=CatalogService.remove(..)</w:t>
               <w:br/>
               <w:t>[2] INFO  kz.iitu.springlab.aspect.LoggingAspect   : [LOG] -&gt; CatalogService.remove(..) args=[0]</w:t>
               <w:br/>
@@ -1773,6 +1941,62 @@
           <w:sz w:val="22"/>
         </w:rPr>
         <w:t>Calling GET /api/lab4/proxy reveals the internal proxy mechanism created by Spring Boot for CatalogService:</w:t>
+      </w:r>
+    </w:p>
+    <w:p>
+      <w:pPr>
+        <w:keepNext/>
+        <w:spacing w:before="160" w:after="40"/>
+        <w:jc w:val="center"/>
+      </w:pPr>
+      <w:r>
+        <w:drawing>
+          <wp:inline xmlns:a="http://schemas.openxmlformats.org/drawingml/2006/main" xmlns:pic="http://schemas.openxmlformats.org/drawingml/2006/picture">
+            <wp:extent cx="5577840" cy="2957780"/>
+            <wp:docPr id="4" name="Picture 4"/>
+            <wp:cNvGraphicFramePr>
+              <a:graphicFrameLocks noChangeAspect="1"/>
+            </wp:cNvGraphicFramePr>
+            <a:graphic>
+              <a:graphicData uri="http://schemas.openxmlformats.org/drawingml/2006/picture">
+                <pic:pic>
+                  <pic:nvPicPr>
+                    <pic:cNvPr id="0" name="media_1790648721983.png"/>
+                    <pic:cNvPicPr/>
+                  </pic:nvPicPr>
+                  <pic:blipFill>
+                    <a:blip r:embed="rId12"/>
+                    <a:stretch>
+                      <a:fillRect/>
+                    </a:stretch>
+                  </pic:blipFill>
+                  <pic:spPr>
+                    <a:xfrm>
+                      <a:off x="0" y="0"/>
+                      <a:ext cx="5577840" cy="2957780"/>
+                    </a:xfrm>
+                    <a:prstGeom prst="rect"/>
+                  </pic:spPr>
+                </pic:pic>
+              </a:graphicData>
+            </a:graphic>
+          </wp:inline>
+        </w:drawing>
+      </w:r>
+    </w:p>
+    <w:p>
+      <w:pPr>
+        <w:spacing w:before="40" w:after="160"/>
+        <w:jc w:val="center"/>
+      </w:pPr>
+      <w:r>
+        <w:rPr>
+          <w:rFonts w:ascii="Calibri" w:hAnsi="Calibri"/>
+          <w:i/>
+          <w:color w:val="505050"/>
+          <w:sz w:val="19"/>
+        </w:rPr>
+        <w:t>Figure 4: Browser response of /api/lab4/proxy confirming CGLIB subclass proxying</w:t>
       </w:r>
     </w:p>
     <w:tbl>
@@ -2257,6 +2481,75 @@
           <w:color w:val="1E1E1E"/>
           <w:sz w:val="22"/>
         </w:rPr>
+        <w:t>Self-Invocation Console Demonstration:</w:t>
+      </w:r>
+    </w:p>
+    <w:p>
+      <w:pPr>
+        <w:keepNext/>
+        <w:spacing w:before="160" w:after="40"/>
+        <w:jc w:val="center"/>
+      </w:pPr>
+      <w:r>
+        <w:drawing>
+          <wp:inline xmlns:a="http://schemas.openxmlformats.org/drawingml/2006/main" xmlns:pic="http://schemas.openxmlformats.org/drawingml/2006/picture">
+            <wp:extent cx="5577840" cy="2963228"/>
+            <wp:docPr id="5" name="Picture 5"/>
+            <wp:cNvGraphicFramePr>
+              <a:graphicFrameLocks noChangeAspect="1"/>
+            </wp:cNvGraphicFramePr>
+            <a:graphic>
+              <a:graphicData uri="http://schemas.openxmlformats.org/drawingml/2006/picture">
+                <pic:pic>
+                  <pic:nvPicPr>
+                    <pic:cNvPr id="0" name="media_1790648843336.png"/>
+                    <pic:cNvPicPr/>
+                  </pic:nvPicPr>
+                  <pic:blipFill>
+                    <a:blip r:embed="rId13"/>
+                    <a:stretch>
+                      <a:fillRect/>
+                    </a:stretch>
+                  </pic:blipFill>
+                  <pic:spPr>
+                    <a:xfrm>
+                      <a:off x="0" y="0"/>
+                      <a:ext cx="5577840" cy="2963228"/>
+                    </a:xfrm>
+                    <a:prstGeom prst="rect"/>
+                  </pic:spPr>
+                </pic:pic>
+              </a:graphicData>
+            </a:graphic>
+          </wp:inline>
+        </w:drawing>
+      </w:r>
+    </w:p>
+    <w:p>
+      <w:pPr>
+        <w:spacing w:before="40" w:after="160"/>
+        <w:jc w:val="center"/>
+      </w:pPr>
+      <w:r>
+        <w:rPr>
+          <w:rFonts w:ascii="Calibri" w:hAnsi="Calibri"/>
+          <w:i/>
+          <w:color w:val="505050"/>
+          <w:sz w:val="19"/>
+        </w:rPr>
+        <w:t>Figure 5: Comparison of removeTwice (bypassing proxy) vs removeTwiceFixed (intercepting calls via proxy)</w:t>
+      </w:r>
+    </w:p>
+    <w:p>
+      <w:pPr>
+        <w:spacing w:before="40" w:after="80" w:line="276" w:lineRule="auto"/>
+      </w:pPr>
+      <w:r>
+        <w:rPr>
+          <w:rFonts w:ascii="Calibri" w:hAnsi="Calibri"/>
+          <w:color w:val="1E1E1E"/>
+          <w:sz w:val="22"/>
+        </w:rPr>
         <w:t>Before Fix (GET /api/lab4/remove-twice/5 via this.remove):</w:t>
       </w:r>
     </w:p>
@@ -2356,7 +2649,7 @@
               <w:br/>
               <w:t># First call (id=5):</w:t>
               <w:br/>
-              <w:t>INFO  kz.iitu.springlab.aspect.AuditAspect   : [AUDIT] start CATALOG_REMOVE at 2026-09-29 06:48:31 method=CatalogService.remove(..)</w:t>
+              <w:t>INFO  kz.iitu.springlab.aspect.AuditAspect   : [AUDIT] start CATALOG_REMOVE at 2026-09-29 07:26:17 method=CatalogService.remove(..)</w:t>
               <w:br/>
               <w:t>INFO  kz.iitu.springlab.aspect.LoggingAspect : [LOG] -&gt; CatalogService.remove(..) args=[5]</w:t>
               <w:br/>
@@ -2368,7 +2661,7 @@
               <w:br/>
               <w:t># Second call (id=6):</w:t>
               <w:br/>
-              <w:t>INFO  kz.iitu.springlab.aspect.AuditAspect   : [AUDIT] start CATALOG_REMOVE at 2026-09-29 06:48:31 method=CatalogService.remove(..)</w:t>
+              <w:t>INFO  kz.iitu.springlab.aspect.AuditAspect   : [AUDIT] start CATALOG_REMOVE at 2026-09-29 07:26:17 method=CatalogService.remove(..)</w:t>
               <w:br/>
               <w:t>INFO  kz.iitu.springlab.aspect.LoggingAspect : [LOG] -&gt; CatalogService.remove(..) args=[6]</w:t>
               <w:br/>
@@ -2431,6 +2724,62 @@
           <w:sz w:val="22"/>
         </w:rPr>
         <w:t>Variant 2 requires an @Around advice that reads a threshold from application.yml via @Value and collects slow method invocations into a list.</w:t>
+      </w:r>
+    </w:p>
+    <w:p>
+      <w:pPr>
+        <w:keepNext/>
+        <w:spacing w:before="160" w:after="40"/>
+        <w:jc w:val="center"/>
+      </w:pPr>
+      <w:r>
+        <w:drawing>
+          <wp:inline xmlns:a="http://schemas.openxmlformats.org/drawingml/2006/main" xmlns:pic="http://schemas.openxmlformats.org/drawingml/2006/picture">
+            <wp:extent cx="5577840" cy="2968675"/>
+            <wp:docPr id="6" name="Picture 6"/>
+            <wp:cNvGraphicFramePr>
+              <a:graphicFrameLocks noChangeAspect="1"/>
+            </wp:cNvGraphicFramePr>
+            <a:graphic>
+              <a:graphicData uri="http://schemas.openxmlformats.org/drawingml/2006/picture">
+                <pic:pic>
+                  <pic:nvPicPr>
+                    <pic:cNvPr id="0" name="media_1790648877208.png"/>
+                    <pic:cNvPicPr/>
+                  </pic:nvPicPr>
+                  <pic:blipFill>
+                    <a:blip r:embed="rId14"/>
+                    <a:stretch>
+                      <a:fillRect/>
+                    </a:stretch>
+                  </pic:blipFill>
+                  <pic:spPr>
+                    <a:xfrm>
+                      <a:off x="0" y="0"/>
+                      <a:ext cx="5577840" cy="2968675"/>
+                    </a:xfrm>
+                    <a:prstGeom prst="rect"/>
+                  </pic:spPr>
+                </pic:pic>
+              </a:graphicData>
+            </a:graphic>
+          </wp:inline>
+        </w:drawing>
+      </w:r>
+    </w:p>
+    <w:p>
+      <w:pPr>
+        <w:spacing w:before="40" w:after="160"/>
+        <w:jc w:val="center"/>
+      </w:pPr>
+      <w:r>
+        <w:rPr>
+          <w:rFonts w:ascii="Calibri" w:hAnsi="Calibri"/>
+          <w:i/>
+          <w:color w:val="505050"/>
+          <w:sz w:val="19"/>
+        </w:rPr>
+        <w:t>Figure 6: Browser output of /api/lab4/slow-methods displaying recorded slow method invocations</w:t>
       </w:r>
     </w:p>
     <w:p>
@@ -2669,7 +3018,7 @@
               <w:br/>
               <w:t xml:space="preserve">    "thresholdMs": 200,</w:t>
               <w:br/>
-              <w:t xml:space="preserve">    "timestamp": "2026-09-29 06:48:31",</w:t>
+              <w:t xml:space="preserve">    "timestamp": "2026-09-29 07:21:43",</w:t>
               <w:br/>
               <w:t xml:space="preserve">    "arguments": "[5]"</w:t>
               <w:br/>

</xml_diff>

<commit_message>
docs: move github repository and PR link after individual assignment section
</commit_message>
<xml_diff>
--- a/Lab04_Akishev_IS-2406.docx
+++ b/Lab04_Akishev_IS-2406.docx
@@ -226,7 +226,7 @@
           <w:color w:val="1A365D"/>
           <w:sz w:val="32"/>
         </w:rPr>
-        <w:t>1. Aim of the Work and Repository Link</w:t>
+        <w:t>1. Aim of the Work</w:t>
       </w:r>
     </w:p>
     <w:p>
@@ -240,130 +240,6 @@
           <w:sz w:val="22"/>
         </w:rPr>
         <w:t>The aim of this laboratory work is to master isolating cross-cutting concerns into modular aspects using Spring AOP: declaring aspects with @Aspect and @Component, writing reusable pointcut expressions in the AspectJ pointcut language, applying all five advice types (@Before, @AfterReturning, @AfterThrowing, @After, @Around), controlling aspect execution precedence with @Order, and binding advice to custom annotations. An essential practical objective is observing Spring Boot's CGLIB proxying mechanism in action and experimentally verifying that self-invocation bypasses the proxy.</w:t>
-      </w:r>
-    </w:p>
-    <w:p>
-      <w:pPr>
-        <w:spacing w:before="40" w:after="80" w:line="276" w:lineRule="auto"/>
-      </w:pPr>
-      <w:r>
-        <w:rPr>
-          <w:rFonts w:ascii="Calibri" w:hAnsi="Calibri"/>
-          <w:b/>
-          <w:sz w:val="22"/>
-        </w:rPr>
-        <w:t xml:space="preserve">Source Code Repository: </w:t>
-      </w:r>
-      <w:r>
-        <w:rPr>
-          <w:rFonts w:ascii="Calibri" w:hAnsi="Calibri"/>
-          <w:color w:val="1E1E1E"/>
-          <w:sz w:val="22"/>
-        </w:rPr>
-        <w:t>Git Repository:</w:t>
-      </w:r>
-    </w:p>
-    <w:p>
-      <w:pPr>
-        <w:spacing w:before="40" w:after="80" w:line="276" w:lineRule="auto"/>
-      </w:pPr>
-      <w:r>
-        <w:rPr>
-          <w:rFonts w:ascii="Calibri" w:hAnsi="Calibri"/>
-          <w:color w:val="1E1E1E"/>
-          <w:sz w:val="22"/>
-        </w:rPr>
-        <w:t>https://github.com/adilkhanakishev/spring-lab-01 (branch: lab04)</w:t>
-      </w:r>
-    </w:p>
-    <w:p>
-      <w:pPr>
-        <w:spacing w:before="40" w:after="80" w:line="276" w:lineRule="auto"/>
-      </w:pPr>
-      <w:r>
-        <w:rPr>
-          <w:rFonts w:ascii="Calibri" w:hAnsi="Calibri"/>
-          <w:b/>
-          <w:sz w:val="22"/>
-        </w:rPr>
-        <w:t xml:space="preserve">Pull Request Link: </w:t>
-      </w:r>
-      <w:r>
-        <w:rPr>
-          <w:rFonts w:ascii="Calibri" w:hAnsi="Calibri"/>
-          <w:color w:val="1E1E1E"/>
-          <w:sz w:val="22"/>
-        </w:rPr>
-        <w:t>GitHub Pull Request:</w:t>
-      </w:r>
-    </w:p>
-    <w:p>
-      <w:pPr>
-        <w:spacing w:before="40" w:after="80" w:line="276" w:lineRule="auto"/>
-      </w:pPr>
-      <w:r>
-        <w:rPr>
-          <w:rFonts w:ascii="Calibri" w:hAnsi="Calibri"/>
-          <w:color w:val="1E1E1E"/>
-          <w:sz w:val="22"/>
-        </w:rPr>
-        <w:t>https://github.com/adilkhanakishev/spring-lab-01/pull/3</w:t>
-      </w:r>
-    </w:p>
-    <w:p>
-      <w:pPr>
-        <w:keepNext/>
-        <w:spacing w:before="160" w:after="40"/>
-        <w:jc w:val="center"/>
-      </w:pPr>
-      <w:r>
-        <w:drawing>
-          <wp:inline xmlns:a="http://schemas.openxmlformats.org/drawingml/2006/main" xmlns:pic="http://schemas.openxmlformats.org/drawingml/2006/picture">
-            <wp:extent cx="5577840" cy="2952333"/>
-            <wp:docPr id="1" name="Picture 1"/>
-            <wp:cNvGraphicFramePr>
-              <a:graphicFrameLocks noChangeAspect="1"/>
-            </wp:cNvGraphicFramePr>
-            <a:graphic>
-              <a:graphicData uri="http://schemas.openxmlformats.org/drawingml/2006/picture">
-                <pic:pic>
-                  <pic:nvPicPr>
-                    <pic:cNvPr id="0" name="media_1790648919795.png"/>
-                    <pic:cNvPicPr/>
-                  </pic:nvPicPr>
-                  <pic:blipFill>
-                    <a:blip r:embed="rId9"/>
-                    <a:stretch>
-                      <a:fillRect/>
-                    </a:stretch>
-                  </pic:blipFill>
-                  <pic:spPr>
-                    <a:xfrm>
-                      <a:off x="0" y="0"/>
-                      <a:ext cx="5577840" cy="2952333"/>
-                    </a:xfrm>
-                    <a:prstGeom prst="rect"/>
-                  </pic:spPr>
-                </pic:pic>
-              </a:graphicData>
-            </a:graphic>
-          </wp:inline>
-        </w:drawing>
-      </w:r>
-    </w:p>
-    <w:p>
-      <w:pPr>
-        <w:spacing w:before="40" w:after="160"/>
-        <w:jc w:val="center"/>
-      </w:pPr>
-      <w:r>
-        <w:rPr>
-          <w:rFonts w:ascii="Calibri" w:hAnsi="Calibri"/>
-          <w:i/>
-          <w:color w:val="505050"/>
-          <w:sz w:val="19"/>
-        </w:rPr>
-        <w:t>Figure 1: Official GitHub Pull Request #3 (lab04 -&gt; main)</w:t>
       </w:r>
     </w:p>
     <w:p>
@@ -1187,7 +1063,7 @@
         <w:drawing>
           <wp:inline xmlns:a="http://schemas.openxmlformats.org/drawingml/2006/main" xmlns:pic="http://schemas.openxmlformats.org/drawingml/2006/picture">
             <wp:extent cx="5577840" cy="2974122"/>
-            <wp:docPr id="2" name="Picture 2"/>
+            <wp:docPr id="1" name="Picture 1"/>
             <wp:cNvGraphicFramePr>
               <a:graphicFrameLocks noChangeAspect="1"/>
             </wp:cNvGraphicFramePr>
@@ -1199,7 +1075,7 @@
                     <pic:cNvPicPr/>
                   </pic:nvPicPr>
                   <pic:blipFill>
-                    <a:blip r:embed="rId10"/>
+                    <a:blip r:embed="rId9"/>
                     <a:stretch>
                       <a:fillRect/>
                     </a:stretch>
@@ -1230,7 +1106,7 @@
           <w:color w:val="505050"/>
           <w:sz w:val="19"/>
         </w:rPr>
-        <w:t>Figure 2: Execution log in IntelliJ IDEA Run console for GET /api/lab4/items?limit=5</w:t>
+        <w:t>Figure 1: Execution log in IntelliJ IDEA Run console for GET /api/lab4/items?limit=5</w:t>
       </w:r>
     </w:p>
     <w:tbl>
@@ -1766,7 +1642,7 @@
         <w:drawing>
           <wp:inline xmlns:a="http://schemas.openxmlformats.org/drawingml/2006/main" xmlns:pic="http://schemas.openxmlformats.org/drawingml/2006/picture">
             <wp:extent cx="5577840" cy="2990463"/>
-            <wp:docPr id="3" name="Picture 3"/>
+            <wp:docPr id="2" name="Picture 2"/>
             <wp:cNvGraphicFramePr>
               <a:graphicFrameLocks noChangeAspect="1"/>
             </wp:cNvGraphicFramePr>
@@ -1778,7 +1654,7 @@
                     <pic:cNvPicPr/>
                   </pic:nvPicPr>
                   <pic:blipFill>
-                    <a:blip r:embed="rId11"/>
+                    <a:blip r:embed="rId10"/>
                     <a:stretch>
                       <a:fillRect/>
                     </a:stretch>
@@ -1809,7 +1685,7 @@
           <w:color w:val="505050"/>
           <w:sz w:val="19"/>
         </w:rPr>
-        <w:t>Figure 3: Exception handling log in IntelliJ IDEA Run console for DELETE /api/lab4/item/0</w:t>
+        <w:t>Figure 2: Exception handling log in IntelliJ IDEA Run console for DELETE /api/lab4/item/0</w:t>
       </w:r>
     </w:p>
     <w:tbl>
@@ -1953,7 +1829,7 @@
         <w:drawing>
           <wp:inline xmlns:a="http://schemas.openxmlformats.org/drawingml/2006/main" xmlns:pic="http://schemas.openxmlformats.org/drawingml/2006/picture">
             <wp:extent cx="5577840" cy="2957780"/>
-            <wp:docPr id="4" name="Picture 4"/>
+            <wp:docPr id="3" name="Picture 3"/>
             <wp:cNvGraphicFramePr>
               <a:graphicFrameLocks noChangeAspect="1"/>
             </wp:cNvGraphicFramePr>
@@ -1965,7 +1841,7 @@
                     <pic:cNvPicPr/>
                   </pic:nvPicPr>
                   <pic:blipFill>
-                    <a:blip r:embed="rId12"/>
+                    <a:blip r:embed="rId11"/>
                     <a:stretch>
                       <a:fillRect/>
                     </a:stretch>
@@ -1996,7 +1872,7 @@
           <w:color w:val="505050"/>
           <w:sz w:val="19"/>
         </w:rPr>
-        <w:t>Figure 4: Browser response of /api/lab4/proxy confirming CGLIB subclass proxying</w:t>
+        <w:t>Figure 3: Browser response of /api/lab4/proxy confirming CGLIB subclass proxying</w:t>
       </w:r>
     </w:p>
     <w:tbl>
@@ -2494,7 +2370,7 @@
         <w:drawing>
           <wp:inline xmlns:a="http://schemas.openxmlformats.org/drawingml/2006/main" xmlns:pic="http://schemas.openxmlformats.org/drawingml/2006/picture">
             <wp:extent cx="5577840" cy="2963228"/>
-            <wp:docPr id="5" name="Picture 5"/>
+            <wp:docPr id="4" name="Picture 4"/>
             <wp:cNvGraphicFramePr>
               <a:graphicFrameLocks noChangeAspect="1"/>
             </wp:cNvGraphicFramePr>
@@ -2506,7 +2382,7 @@
                     <pic:cNvPicPr/>
                   </pic:nvPicPr>
                   <pic:blipFill>
-                    <a:blip r:embed="rId13"/>
+                    <a:blip r:embed="rId12"/>
                     <a:stretch>
                       <a:fillRect/>
                     </a:stretch>
@@ -2537,7 +2413,7 @@
           <w:color w:val="505050"/>
           <w:sz w:val="19"/>
         </w:rPr>
-        <w:t>Figure 5: Comparison of removeTwice (bypassing proxy) vs removeTwiceFixed (intercepting calls via proxy)</w:t>
+        <w:t>Figure 4: Comparison of removeTwice (bypassing proxy) vs removeTwiceFixed (intercepting calls via proxy)</w:t>
       </w:r>
     </w:p>
     <w:p>
@@ -2736,7 +2612,7 @@
         <w:drawing>
           <wp:inline xmlns:a="http://schemas.openxmlformats.org/drawingml/2006/main" xmlns:pic="http://schemas.openxmlformats.org/drawingml/2006/picture">
             <wp:extent cx="5577840" cy="2968675"/>
-            <wp:docPr id="6" name="Picture 6"/>
+            <wp:docPr id="5" name="Picture 5"/>
             <wp:cNvGraphicFramePr>
               <a:graphicFrameLocks noChangeAspect="1"/>
             </wp:cNvGraphicFramePr>
@@ -2748,7 +2624,7 @@
                     <pic:cNvPicPr/>
                   </pic:nvPicPr>
                   <pic:blipFill>
-                    <a:blip r:embed="rId14"/>
+                    <a:blip r:embed="rId13"/>
                     <a:stretch>
                       <a:fillRect/>
                     </a:stretch>
@@ -2779,7 +2655,7 @@
           <w:color w:val="505050"/>
           <w:sz w:val="19"/>
         </w:rPr>
-        <w:t>Figure 6: Browser output of /api/lab4/slow-methods displaying recorded slow method invocations</w:t>
+        <w:t>Figure 5: Browser output of /api/lab4/slow-methods displaying recorded slow method invocations</w:t>
       </w:r>
     </w:p>
     <w:p>
@@ -3048,7 +2924,134 @@
           <w:color w:val="1A365D"/>
           <w:sz w:val="32"/>
         </w:rPr>
-        <w:t>9. Conclusions</w:t>
+        <w:t>9. Source Code Repository and Pull Request Verification</w:t>
+      </w:r>
+    </w:p>
+    <w:p>
+      <w:pPr>
+        <w:spacing w:before="40" w:after="80" w:line="276" w:lineRule="auto"/>
+      </w:pPr>
+      <w:r>
+        <w:rPr>
+          <w:rFonts w:ascii="Calibri" w:hAnsi="Calibri"/>
+          <w:color w:val="1E1E1E"/>
+          <w:sz w:val="22"/>
+        </w:rPr>
+        <w:t>All source code, aspects, configuration files, and automated unit/integration tests developed for Laboratory Work No. 4 were version-controlled using Git on the dedicated feature branch lab04 and pushed to the remote GitHub repository. To review, track changes, and merge the implementation into the main branch, an official Pull Request was registered:</w:t>
+      </w:r>
+    </w:p>
+    <w:p>
+      <w:pPr>
+        <w:spacing w:before="40" w:after="80" w:line="276" w:lineRule="auto"/>
+      </w:pPr>
+      <w:r>
+        <w:rPr>
+          <w:rFonts w:ascii="Calibri" w:hAnsi="Calibri"/>
+          <w:b/>
+          <w:sz w:val="22"/>
+        </w:rPr>
+        <w:t xml:space="preserve">Source Code Repository: </w:t>
+      </w:r>
+      <w:r>
+        <w:rPr>
+          <w:rFonts w:ascii="Calibri" w:hAnsi="Calibri"/>
+          <w:color w:val="1E1E1E"/>
+          <w:sz w:val="22"/>
+        </w:rPr>
+        <w:t>https://github.com/adilkhanakishev/spring-lab-01 (branch: lab04)</w:t>
+      </w:r>
+    </w:p>
+    <w:p>
+      <w:pPr>
+        <w:spacing w:before="40" w:after="80" w:line="276" w:lineRule="auto"/>
+      </w:pPr>
+      <w:r>
+        <w:rPr>
+          <w:rFonts w:ascii="Calibri" w:hAnsi="Calibri"/>
+          <w:b/>
+          <w:sz w:val="22"/>
+        </w:rPr>
+        <w:t xml:space="preserve">GitHub Pull Request: </w:t>
+      </w:r>
+      <w:r>
+        <w:rPr>
+          <w:rFonts w:ascii="Calibri" w:hAnsi="Calibri"/>
+          <w:color w:val="1E1E1E"/>
+          <w:sz w:val="22"/>
+        </w:rPr>
+        <w:t>https://github.com/adilkhanakishev/spring-lab-01/pull/3</w:t>
+      </w:r>
+    </w:p>
+    <w:p>
+      <w:pPr>
+        <w:keepNext/>
+        <w:spacing w:before="160" w:after="40"/>
+        <w:jc w:val="center"/>
+      </w:pPr>
+      <w:r>
+        <w:drawing>
+          <wp:inline xmlns:a="http://schemas.openxmlformats.org/drawingml/2006/main" xmlns:pic="http://schemas.openxmlformats.org/drawingml/2006/picture">
+            <wp:extent cx="5577840" cy="2952333"/>
+            <wp:docPr id="6" name="Picture 6"/>
+            <wp:cNvGraphicFramePr>
+              <a:graphicFrameLocks noChangeAspect="1"/>
+            </wp:cNvGraphicFramePr>
+            <a:graphic>
+              <a:graphicData uri="http://schemas.openxmlformats.org/drawingml/2006/picture">
+                <pic:pic>
+                  <pic:nvPicPr>
+                    <pic:cNvPr id="0" name="media_1790648919795.png"/>
+                    <pic:cNvPicPr/>
+                  </pic:nvPicPr>
+                  <pic:blipFill>
+                    <a:blip r:embed="rId14"/>
+                    <a:stretch>
+                      <a:fillRect/>
+                    </a:stretch>
+                  </pic:blipFill>
+                  <pic:spPr>
+                    <a:xfrm>
+                      <a:off x="0" y="0"/>
+                      <a:ext cx="5577840" cy="2952333"/>
+                    </a:xfrm>
+                    <a:prstGeom prst="rect"/>
+                  </pic:spPr>
+                </pic:pic>
+              </a:graphicData>
+            </a:graphic>
+          </wp:inline>
+        </w:drawing>
+      </w:r>
+    </w:p>
+    <w:p>
+      <w:pPr>
+        <w:spacing w:before="40" w:after="160"/>
+        <w:jc w:val="center"/>
+      </w:pPr>
+      <w:r>
+        <w:rPr>
+          <w:rFonts w:ascii="Calibri" w:hAnsi="Calibri"/>
+          <w:i/>
+          <w:color w:val="505050"/>
+          <w:sz w:val="19"/>
+        </w:rPr>
+        <w:t>Figure 6: Official GitHub Pull Request #3 (lab04 -&gt; main)</w:t>
+      </w:r>
+    </w:p>
+    <w:p>
+      <w:pPr>
+        <w:pStyle w:val="Heading1"/>
+        <w:keepNext/>
+        <w:spacing w:before="240" w:after="80"/>
+      </w:pPr>
+      <w:r>
+        <w:rPr>
+          <w:rFonts w:ascii="Calibri" w:hAnsi="Calibri"/>
+          <w:b/>
+          <w:color w:val="1A365D"/>
+          <w:sz w:val="32"/>
+        </w:rPr>
+        <w:t>10. Conclusions</w:t>
       </w:r>
     </w:p>
     <w:p>
@@ -3116,7 +3119,7 @@
           <w:color w:val="1A365D"/>
           <w:sz w:val="32"/>
         </w:rPr>
-        <w:t>10. Questions and Answers for Demonstration</w:t>
+        <w:t>11. Questions and Answers for Demonstration</w:t>
       </w:r>
     </w:p>
     <w:p>

</xml_diff>